<commit_message>
feat(temario): mismo estilo en todos los esquemas, tema 1 regenerado y enunciado del tema 15
Fechas en letra, porcentaje con espacio, M€, EEUU, art. y Real Decreto con
todas las letras en los 90 esquemas rehechos. Word y PDF regenerados.

Co-Authored-By: Claude Opus 5.5 <noreply@anthropic.com>
Claude-Session: https://claude.ai/code/session_01TgcHGjKvdTU8JVzXVkS48z
</commit_message>
<xml_diff>
--- a/public/temas/ejercicio-1/ESQUEMA TEMA 10.docx
+++ b/public/temas/ejercicio-1/ESQUEMA TEMA 10.docx
@@ -276,7 +276,7 @@
           <w:b/>
           <w:sz w:val="22"/>
         </w:rPr>
-        <w:t>RD 176/2013</w:t>
+        <w:t>Real Decreto 176/2013</w:t>
       </w:r>
       <w:r>
         <w:rPr>
@@ -319,7 +319,7 @@
           <w:b/>
           <w:sz w:val="22"/>
         </w:rPr>
-        <w:t>RD 1109/1991</w:t>
+        <w:t>Real Decreto 1109/1991</w:t>
       </w:r>
       <w:r>
         <w:rPr>
@@ -617,7 +617,7 @@
           <w:b/>
           <w:sz w:val="22"/>
         </w:rPr>
-        <w:t>RD 2420/1978</w:t>
+        <w:t>Real Decreto 2420/1978</w:t>
       </w:r>
       <w:r>
         <w:rPr>
@@ -632,7 +632,7 @@
           <w:b/>
           <w:sz w:val="22"/>
         </w:rPr>
-        <w:t>Orden de 21-11-1984</w:t>
+        <w:t>Orden de 21 de noviembre de 1984</w:t>
       </w:r>
       <w:r>
         <w:rPr>
@@ -654,7 +654,7 @@
           <w:b/>
           <w:sz w:val="22"/>
         </w:rPr>
-        <w:t>RD 863/2003</w:t>
+        <w:t>Real Decreto 863/2003</w:t>
       </w:r>
       <w:r>
         <w:rPr>
@@ -691,14 +691,14 @@
           <w:b/>
           <w:sz w:val="22"/>
         </w:rPr>
-        <w:t>RD 1026/2025</w:t>
+        <w:t>Real Decreto 1026/2025</w:t>
       </w:r>
       <w:r>
         <w:rPr>
           <w:rFonts w:ascii="Cambria" w:hAnsi="Cambria" w:cs="Cambria" w:eastAsia="Cambria"/>
           <w:sz w:val="22"/>
         </w:rPr>
-        <w:t xml:space="preserve"> (obligatorio desde 14-6-2026): más fruta mínima, zumos concentrados, categoría con azúcares reducidos (mín. </w:t>
+        <w:t xml:space="preserve"> (obligatorio desde 14 de junio de 2026): más fruta mínima, zumos concentrados, categoría con azúcares reducidos (mín. </w:t>
       </w:r>
       <w:r>
         <w:rPr>
@@ -1721,7 +1721,7 @@
           <w:b/>
           <w:sz w:val="22"/>
         </w:rPr>
-        <w:t>RD 175/2004</w:t>
+        <w:t>Real Decreto 175/2004</w:t>
       </w:r>
       <w:r>
         <w:rPr>
@@ -2118,7 +2118,7 @@
           <w:b/>
           <w:sz w:val="22"/>
         </w:rPr>
-        <w:t>RD 1201/2002</w:t>
+        <w:t>Real Decreto 1201/2002</w:t>
       </w:r>
       <w:r>
         <w:rPr>
@@ -2236,7 +2236,7 @@
           <w:b/>
           <w:sz w:val="22"/>
         </w:rPr>
-        <w:t>RD 679/2016</w:t>
+        <w:t>Real Decreto 679/2016</w:t>
       </w:r>
       <w:r>
         <w:rPr>
@@ -2258,7 +2258,7 @@
           <w:b/>
           <w:sz w:val="22"/>
         </w:rPr>
-        <w:t>RD 946/2003</w:t>
+        <w:t>Real Decreto 946/2003</w:t>
       </w:r>
       <w:r>
         <w:rPr>
@@ -2280,7 +2280,7 @@
           <w:b/>
           <w:sz w:val="22"/>
         </w:rPr>
-        <w:t>RD 1109/1991</w:t>
+        <w:t>Real Decreto 1109/1991</w:t>
       </w:r>
       <w:r>
         <w:rPr>
@@ -2317,7 +2317,7 @@
           <w:b/>
           <w:sz w:val="22"/>
         </w:rPr>
-        <w:t>RD 863/2003</w:t>
+        <w:t>Real Decreto 863/2003</w:t>
       </w:r>
       <w:r>
         <w:rPr>
@@ -2332,7 +2332,7 @@
           <w:b/>
           <w:sz w:val="22"/>
         </w:rPr>
-        <w:t>RD 1026/2025</w:t>
+        <w:t>Real Decreto 1026/2025</w:t>
       </w:r>
       <w:r>
         <w:rPr>
@@ -2354,7 +2354,7 @@
           <w:b/>
           <w:sz w:val="22"/>
         </w:rPr>
-        <w:t>RD 781/2013</w:t>
+        <w:t>Real Decreto 781/2013</w:t>
       </w:r>
       <w:r>
         <w:rPr>
@@ -2369,7 +2369,7 @@
           <w:b/>
           <w:sz w:val="22"/>
         </w:rPr>
-        <w:t>RD 1026/2025</w:t>
+        <w:t>Real Decreto 1026/2025</w:t>
       </w:r>
     </w:p>
     <w:p>
@@ -2426,7 +2426,7 @@
           <w:b/>
           <w:sz w:val="22"/>
         </w:rPr>
-        <w:t>RD 175/2004</w:t>
+        <w:t>Real Decreto 175/2004</w:t>
       </w:r>
       <w:r>
         <w:rPr>
@@ -2514,7 +2514,7 @@
           <w:b/>
           <w:sz w:val="22"/>
         </w:rPr>
-        <w:t>RD 1055/2022</w:t>
+        <w:t>Real Decreto 1055/2022</w:t>
       </w:r>
       <w:r>
         <w:rPr>

</xml_diff>